<commit_message>
3.1 solutions and fixes
</commit_message>
<xml_diff>
--- a/docs/6-exams/practice/midterm1-practice.docx
+++ b/docs/6-exams/practice/midterm1-practice.docx
@@ -360,25 +360,13 @@
       </w:r>
     </w:p>
     <w:bookmarkEnd w:id="10"/>
-    <w:bookmarkStart w:id="12" w:name="Xb3b99f1846d8af9f9ff9ecd6770e248d92805d6"/>
+    <w:bookmarkStart w:id="12" w:name="scenario-3.-lung-volume"/>
     <w:p>
       <w:pPr>
         <w:pStyle w:val="Heading2"/>
       </w:pPr>
       <w:r>
-        <w:t xml:space="preserve">Scenario 3. Lung Volume [Download</w:t>
-      </w:r>
-      <w:r>
-        <w:t xml:space="preserve"> </w:t>
-      </w:r>
-      <w:r>
-        <w:rPr>
-          <w:rStyle w:val="VerbatimChar"/>
-        </w:rPr>
-        <w:t xml:space="preserve">lung-volume-data.csv</w:t>
-      </w:r>
-      <w:r>
-        <w:t xml:space="preserve">]</w:t>
+        <w:t xml:space="preserve">Scenario 3. Lung Volume</w:t>
       </w:r>
     </w:p>
     <w:p>
@@ -408,7 +396,7 @@
         <w:pStyle w:val="BodyText"/>
       </w:pPr>
       <w:r>
-        <w:t xml:space="preserve">A study was conducted to evaluate the effect of elevation on the lung volume of birds raised at specified elevations. Thirty-five environmental chambers which simulated elevations by regulating the air pressure were used. Five elevations (1000ft, 2000ft, 3000ft, 4000ft and 5000ft) were randomly assigned, one-at-a-time, to each of seven chambers, so that there were 7 reps/treatment. Thirty-five baby birds were then randomly assigned, one to each of the chambers. When the birds reached adult age, their lung volumes were determined. Download lung_volume_data.csv.</w:t>
+        <w:t xml:space="preserve">A study was conducted to evaluate the effect of elevation on the lung volume of birds raised at specified elevations. Thirty-five environmental chambers which simulated elevations by regulating the air pressure were used. Five elevations (1000ft, 2000ft, 3000ft, 4000ft and 5000ft) were randomly assigned, one-at-a-time, to each of seven chambers, so that there were 7 reps/treatment. Thirty-five baby birds were then randomly assigned, one to each of the chambers. When the birds reached adult age, their lung volumes were determined.</w:t>
       </w:r>
     </w:p>
     <w:p>
@@ -477,13 +465,10 @@
           </m:accPr>
           <m:e>
             <m:r>
-              <m:t>m</m:t>
+              <m:t>μ</m:t>
             </m:r>
           </m:e>
         </m:acc>
-        <m:r>
-          <m:t>u</m:t>
-        </m:r>
       </m:oMath>
       <w:r>
         <w:t xml:space="preserve">,</w:t>
@@ -540,7 +525,7 @@
         </m:sSup>
       </m:oMath>
       <w:r>
-        <w:t xml:space="preserve">). What do each of these represent in context of the data?</w:t>
+        <w:t xml:space="preserve">) (remember to use the sum-to-zero constraint). What do each of these represent in context of the data?</w:t>
       </w:r>
     </w:p>
     <w:p>
@@ -647,6 +632,99 @@
       </w:pPr>
       <w:r>
         <w:t xml:space="preserve">Could you reverse engineer to create a compact letter display table from the Tukey pairwise comparisons table you found above?</w:t>
+      </w:r>
+    </w:p>
+    <w:p>
+      <w:pPr>
+        <w:numPr>
+          <w:ilvl w:val="0"/>
+          <w:numId w:val="1004"/>
+        </w:numPr>
+      </w:pPr>
+      <w:r>
+        <w:t xml:space="preserve">Explain why it could be preferable to choose one or two defined contrasts before the start of the study to test.</w:t>
+      </w:r>
+    </w:p>
+    <w:p>
+      <w:pPr>
+        <w:numPr>
+          <w:ilvl w:val="0"/>
+          <w:numId w:val="1004"/>
+        </w:numPr>
+      </w:pPr>
+      <w:r>
+        <w:t xml:space="preserve">Let’s test the contrast of 5000ft versus all of the other treatments.</w:t>
+      </w:r>
+    </w:p>
+    <w:p>
+      <w:pPr>
+        <w:pStyle w:val="Compact"/>
+        <w:numPr>
+          <w:ilvl w:val="1"/>
+          <w:numId w:val="1008"/>
+        </w:numPr>
+      </w:pPr>
+      <w:r>
+        <w:t xml:space="preserve">Define the population contrast</w:t>
+      </w:r>
+      <w:r>
+        <w:t xml:space="preserve"> </w:t>
+      </w:r>
+      <m:oMath>
+        <m:r>
+          <m:t>C</m:t>
+        </m:r>
+      </m:oMath>
+    </w:p>
+    <w:p>
+      <w:pPr>
+        <w:pStyle w:val="Compact"/>
+        <w:numPr>
+          <w:ilvl w:val="1"/>
+          <w:numId w:val="1008"/>
+        </w:numPr>
+      </w:pPr>
+      <w:r>
+        <w:t xml:space="preserve">Write out the estimated contrast</w:t>
+      </w:r>
+      <w:r>
+        <w:t xml:space="preserve"> </w:t>
+      </w:r>
+      <m:oMath>
+        <m:acc>
+          <m:accPr>
+            <m:chr m:val="̂"/>
+          </m:accPr>
+          <m:e>
+            <m:r>
+              <m:t>C</m:t>
+            </m:r>
+          </m:e>
+        </m:acc>
+      </m:oMath>
+    </w:p>
+    <w:p>
+      <w:pPr>
+        <w:pStyle w:val="Compact"/>
+        <w:numPr>
+          <w:ilvl w:val="1"/>
+          <w:numId w:val="1008"/>
+        </w:numPr>
+      </w:pPr>
+      <w:r>
+        <w:t xml:space="preserve">Test the contrast using R</w:t>
+      </w:r>
+    </w:p>
+    <w:p>
+      <w:pPr>
+        <w:pStyle w:val="Compact"/>
+        <w:numPr>
+          <w:ilvl w:val="1"/>
+          <w:numId w:val="1008"/>
+        </w:numPr>
+      </w:pPr>
+      <w:r>
+        <w:t xml:space="preserve">What conclusion can you make?</w:t>
       </w:r>
     </w:p>
     <w:bookmarkEnd w:id="12"/>
@@ -869,46 +947,11 @@
       <w:pPr>
         <w:numPr>
           <w:ilvl w:val="0"/>
-          <w:numId w:val="1008"/>
+          <w:numId w:val="1009"/>
         </w:numPr>
       </w:pPr>
       <w:r>
         <w:t xml:space="preserve">Identify the following for this experiment.</w:t>
-      </w:r>
-    </w:p>
-    <w:p>
-      <w:pPr>
-        <w:pStyle w:val="Compact"/>
-        <w:numPr>
-          <w:ilvl w:val="1"/>
-          <w:numId w:val="1009"/>
-        </w:numPr>
-      </w:pPr>
-      <w:r>
-        <w:t xml:space="preserve">Treatment Design:</w:t>
-      </w:r>
-    </w:p>
-    <w:p>
-      <w:pPr>
-        <w:pStyle w:val="Compact"/>
-        <w:numPr>
-          <w:ilvl w:val="1"/>
-          <w:numId w:val="1009"/>
-        </w:numPr>
-      </w:pPr>
-      <w:r>
-        <w:t xml:space="preserve">Experimental Design:</w:t>
-      </w:r>
-    </w:p>
-    <w:p>
-      <w:pPr>
-        <w:numPr>
-          <w:ilvl w:val="0"/>
-          <w:numId w:val="1008"/>
-        </w:numPr>
-      </w:pPr>
-      <w:r>
-        <w:t xml:space="preserve">Identify the following components needed for a power analysis:</w:t>
       </w:r>
     </w:p>
     <w:p>
@@ -917,6 +960,41 @@
         <w:numPr>
           <w:ilvl w:val="1"/>
           <w:numId w:val="1010"/>
+        </w:numPr>
+      </w:pPr>
+      <w:r>
+        <w:t xml:space="preserve">Treatment Design:</w:t>
+      </w:r>
+    </w:p>
+    <w:p>
+      <w:pPr>
+        <w:pStyle w:val="Compact"/>
+        <w:numPr>
+          <w:ilvl w:val="1"/>
+          <w:numId w:val="1010"/>
+        </w:numPr>
+      </w:pPr>
+      <w:r>
+        <w:t xml:space="preserve">Experimental Design:</w:t>
+      </w:r>
+    </w:p>
+    <w:p>
+      <w:pPr>
+        <w:numPr>
+          <w:ilvl w:val="0"/>
+          <w:numId w:val="1009"/>
+        </w:numPr>
+      </w:pPr>
+      <w:r>
+        <w:t xml:space="preserve">Identify the following components needed for a power analysis:</w:t>
+      </w:r>
+    </w:p>
+    <w:p>
+      <w:pPr>
+        <w:pStyle w:val="Compact"/>
+        <w:numPr>
+          <w:ilvl w:val="1"/>
+          <w:numId w:val="1011"/>
         </w:numPr>
       </w:pPr>
       <m:oMath>
@@ -942,7 +1020,7 @@
         <w:pStyle w:val="Compact"/>
         <w:numPr>
           <w:ilvl w:val="1"/>
-          <w:numId w:val="1010"/>
+          <w:numId w:val="1011"/>
         </w:numPr>
       </w:pPr>
       <m:oMath>
@@ -984,7 +1062,7 @@
         <w:pStyle w:val="Compact"/>
         <w:numPr>
           <w:ilvl w:val="1"/>
-          <w:numId w:val="1010"/>
+          <w:numId w:val="1011"/>
         </w:numPr>
       </w:pPr>
       <m:oMath>
@@ -1010,7 +1088,7 @@
         <w:pStyle w:val="Compact"/>
         <w:numPr>
           <w:ilvl w:val="1"/>
-          <w:numId w:val="1010"/>
+          <w:numId w:val="1011"/>
         </w:numPr>
       </w:pPr>
       <m:oMath>
@@ -1055,7 +1133,7 @@
       <w:pPr>
         <w:numPr>
           <w:ilvl w:val="0"/>
-          <w:numId w:val="1008"/>
+          <w:numId w:val="1009"/>
         </w:numPr>
       </w:pPr>
       <w:r>
@@ -1066,7 +1144,7 @@
       <w:pPr>
         <w:numPr>
           <w:ilvl w:val="0"/>
-          <w:numId w:val="1008"/>
+          <w:numId w:val="1009"/>
         </w:numPr>
       </w:pPr>
       <w:r>
@@ -1077,7 +1155,7 @@
       <w:pPr>
         <w:numPr>
           <w:ilvl w:val="0"/>
-          <w:numId w:val="1008"/>
+          <w:numId w:val="1009"/>
         </w:numPr>
       </w:pPr>
       <w:r>
@@ -1106,7 +1184,7 @@
       <w:pPr>
         <w:numPr>
           <w:ilvl w:val="0"/>
-          <w:numId w:val="1011"/>
+          <w:numId w:val="1012"/>
         </w:numPr>
       </w:pPr>
       <w:r>
@@ -1117,7 +1195,7 @@
       <w:pPr>
         <w:numPr>
           <w:ilvl w:val="0"/>
-          <w:numId w:val="1011"/>
+          <w:numId w:val="1012"/>
         </w:numPr>
       </w:pPr>
       <w:r>
@@ -1159,7 +1237,7 @@
       <w:pPr>
         <w:numPr>
           <w:ilvl w:val="0"/>
-          <w:numId w:val="1011"/>
+          <w:numId w:val="1012"/>
         </w:numPr>
       </w:pPr>
       <w:r>
@@ -1382,7 +1460,7 @@
       <w:pPr>
         <w:numPr>
           <w:ilvl w:val="0"/>
-          <w:numId w:val="1012"/>
+          <w:numId w:val="1013"/>
         </w:numPr>
       </w:pPr>
       <w:r>
@@ -1393,7 +1471,7 @@
       <w:pPr>
         <w:numPr>
           <w:ilvl w:val="0"/>
-          <w:numId w:val="1012"/>
+          <w:numId w:val="1013"/>
         </w:numPr>
       </w:pPr>
       <w:r>
@@ -1404,7 +1482,7 @@
       <w:pPr>
         <w:numPr>
           <w:ilvl w:val="0"/>
-          <w:numId w:val="1012"/>
+          <w:numId w:val="1013"/>
         </w:numPr>
       </w:pPr>
       <w:r>
@@ -1415,7 +1493,7 @@
       <w:pPr>
         <w:numPr>
           <w:ilvl w:val="0"/>
-          <w:numId w:val="1012"/>
+          <w:numId w:val="1013"/>
         </w:numPr>
       </w:pPr>
       <w:r>
@@ -1426,7 +1504,7 @@
       <w:pPr>
         <w:numPr>
           <w:ilvl w:val="0"/>
-          <w:numId w:val="1012"/>
+          <w:numId w:val="1013"/>
         </w:numPr>
       </w:pPr>
       <w:r>
@@ -1493,7 +1571,7 @@
       <w:pPr>
         <w:numPr>
           <w:ilvl w:val="0"/>
-          <w:numId w:val="1013"/>
+          <w:numId w:val="1014"/>
         </w:numPr>
       </w:pPr>
       <w:r>
@@ -1504,81 +1582,40 @@
       <w:pPr>
         <w:numPr>
           <w:ilvl w:val="0"/>
-          <w:numId w:val="1013"/>
-        </w:numPr>
-      </w:pPr>
-      <w:r>
-        <w:t xml:space="preserve">Obtain your</w:t>
-      </w:r>
-      <w:r>
-        <w:t xml:space="preserve"> </w:t>
+          <w:numId w:val="1014"/>
+        </w:numPr>
+      </w:pPr>
+      <w:r>
+        <w:t xml:space="preserve">Draw a blueprint of the study.</w:t>
+      </w:r>
+    </w:p>
+    <w:p>
+      <w:pPr>
+        <w:numPr>
+          <w:ilvl w:val="0"/>
+          <w:numId w:val="1014"/>
+        </w:numPr>
+      </w:pPr>
+      <w:r>
+        <w:t xml:space="preserve">Calculate the estimated treatment means using the data.</w:t>
+      </w:r>
+    </w:p>
+    <w:p>
+      <w:pPr>
+        <w:numPr>
+          <w:ilvl w:val="0"/>
+          <w:numId w:val="1014"/>
+        </w:numPr>
+      </w:pPr>
+      <w:r>
+        <w:t xml:space="preserve">Calculate one of the the main effects of fat (butter vs. oil). Define the population effect using notation (i.e. </w:t>
       </w:r>
       <m:oMath>
         <m:sSub>
           <m:e>
-            <m:acc>
-              <m:accPr>
-                <m:chr m:val="̂"/>
-              </m:accPr>
-              <m:e>
-                <m:r>
-                  <m:t>α</m:t>
-                </m:r>
-              </m:e>
-            </m:acc>
-          </m:e>
-          <m:sub>
             <m:r>
-              <m:t>i</m:t>
+              <m:t>μ</m:t>
             </m:r>
-          </m:sub>
-        </m:sSub>
-        <m:r>
-          <m:rPr>
-            <m:sty m:val="p"/>
-          </m:rPr>
-          <m:t>,</m:t>
-        </m:r>
-        <m:sSub>
-          <m:e>
-            <m:acc>
-              <m:accPr>
-                <m:chr m:val="̂"/>
-              </m:accPr>
-              <m:e>
-                <m:r>
-                  <m:t>β</m:t>
-                </m:r>
-              </m:e>
-            </m:acc>
-          </m:e>
-          <m:sub>
-            <m:r>
-              <m:t>j</m:t>
-            </m:r>
-          </m:sub>
-        </m:sSub>
-        <m:r>
-          <m:rPr>
-            <m:sty m:val="p"/>
-          </m:rPr>
-          <m:t>,</m:t>
-        </m:r>
-        <m:sSub>
-          <m:e>
-            <m:acc>
-              <m:accPr>
-                <m:chr m:val="̂"/>
-              </m:accPr>
-              <m:e>
-                <m:r>
-                  <m:t>α</m:t>
-                </m:r>
-                <m:r>
-                  <m:t>β</m:t>
-                </m:r>
-              </m:e>
-            </m:acc>
           </m:e>
           <m:sub>
             <m:r>
@@ -1591,24 +1628,25 @@
         </m:sSub>
       </m:oMath>
       <w:r>
-        <w:t xml:space="preserve">. How do these build your</w:t>
-      </w:r>
-      <w:r>
-        <w:t xml:space="preserve"> </w:t>
+        <w:t xml:space="preserve">) and calculate the estimated main effect. Interpret your estimated effect.</w:t>
+      </w:r>
+    </w:p>
+    <w:p>
+      <w:pPr>
+        <w:numPr>
+          <w:ilvl w:val="0"/>
+          <w:numId w:val="1014"/>
+        </w:numPr>
+      </w:pPr>
+      <w:r>
+        <w:t xml:space="preserve">Calculate the interaction effect of fat (butter vs. oil) and yeast (Brand A vs. Brand B). Define the population effect using notation (i.e. </w:t>
       </w:r>
       <m:oMath>
         <m:sSub>
           <m:e>
-            <m:acc>
-              <m:accPr>
-                <m:chr m:val="̂"/>
-              </m:accPr>
-              <m:e>
-                <m:r>
-                  <m:t>μ</m:t>
-                </m:r>
-              </m:e>
-            </m:acc>
+            <m:r>
+              <m:t>μ</m:t>
+            </m:r>
           </m:e>
           <m:sub>
             <m:r>
@@ -1621,36 +1659,14 @@
         </m:sSub>
       </m:oMath>
       <w:r>
-        <w:t xml:space="preserve">? For example, can you use your estimated parameters/coefficients to find the estimated mean volume of loaves baked with butter and yeast A?</w:t>
-      </w:r>
-    </w:p>
-    <w:p>
-      <w:pPr>
-        <w:numPr>
-          <w:ilvl w:val="0"/>
-          <w:numId w:val="1013"/>
-        </w:numPr>
-      </w:pPr>
-      <w:r>
-        <w:t xml:space="preserve">Based on your conclusion, create the appropriate LSMeans plot (main effects or interaction plot) and interpret either the main effects or interpret the appropriate simple effects.</w:t>
-      </w:r>
-    </w:p>
-    <w:p>
-      <w:pPr>
-        <w:numPr>
-          <w:ilvl w:val="0"/>
-          <w:numId w:val="1013"/>
-        </w:numPr>
-      </w:pPr>
-      <w:r>
-        <w:t xml:space="preserve">Based on the analysis, make a recommendation to the baker about which fat–yeast combination(s) appear to produce the fluffiest loaves.</w:t>
-      </w:r>
-    </w:p>
-    <w:p>
-      <w:pPr>
-        <w:numPr>
-          <w:ilvl w:val="0"/>
-          <w:numId w:val="1013"/>
+        <w:t xml:space="preserve">) and calculate the estimated effect. Interpret your estimated effect.</w:t>
+      </w:r>
+    </w:p>
+    <w:p>
+      <w:pPr>
+        <w:numPr>
+          <w:ilvl w:val="0"/>
+          <w:numId w:val="1014"/>
         </w:numPr>
       </w:pPr>
       <w:r>
@@ -1662,7 +1678,7 @@
         <w:pStyle w:val="Compact"/>
         <w:numPr>
           <w:ilvl w:val="1"/>
-          <w:numId w:val="1014"/>
+          <w:numId w:val="1015"/>
         </w:numPr>
       </w:pPr>
       <w:r>
@@ -1674,7 +1690,7 @@
         <w:pStyle w:val="Compact"/>
         <w:numPr>
           <w:ilvl w:val="1"/>
-          <w:numId w:val="1014"/>
+          <w:numId w:val="1015"/>
         </w:numPr>
       </w:pPr>
       <w:r>
@@ -1702,7 +1718,7 @@
         <w:pStyle w:val="Compact"/>
         <w:numPr>
           <w:ilvl w:val="1"/>
-          <w:numId w:val="1014"/>
+          <w:numId w:val="1015"/>
         </w:numPr>
       </w:pPr>
       <w:r>
@@ -1966,6 +1982,9 @@
     <w:abstractNumId w:val="991"/>
   </w:num>
   <w:num w:numId="1014">
+    <w:abstractNumId w:val="991"/>
+  </w:num>
+  <w:num w:numId="1015">
     <w:abstractNumId w:val="991"/>
   </w:num>
 </w:numbering>

</xml_diff>